<commit_message>
Servidor |  uploads e alteraçoes necessarias
</commit_message>
<xml_diff>
--- a/uploads/Proposta/PropostaBEAUTY BH - OPERACIONAL E CAEX_BEAUTY BH_.docx
+++ b/uploads/Proposta/PropostaBEAUTY BH - OPERACIONAL E CAEX_BEAUTY BH_.docx
@@ -1518,7 +1518,7 @@
           <w:sz w:val="24"/>
           <w:szCs w:val="24"/>
         </w:rPr>
-        <w:t xml:space="preserve">R$ 83.586,28</w:t>
+        <w:t xml:space="preserve">R$ 77.394,70</w:t>
       </w:r>
       <w:r>
         <w:rPr>
@@ -1697,7 +1697,7 @@
           <w:i/>
           <w:iCs/>
         </w:rPr>
-        <w:t xml:space="preserve">18/02/2026</w:t>
+        <w:t xml:space="preserve">26/02/2026</w:t>
       </w:r>
     </w:p>
     <w:p>

</xml_diff>